<commit_message>
feat: used own tracking app
</commit_message>
<xml_diff>
--- a/Docs/Demostration Script.docx
+++ b/Docs/Demostration Script.docx
@@ -5,581 +5,6 @@
     <w:p>
       <w:pPr>
         <w:rPr>
-          <w:rFonts w:ascii="Times New Roman" w:hAnsi="Times New Roman" w:cs="Times New Roman"/>
-          <w:sz w:val="28"/>
-          <w:szCs w:val="28"/>
-        </w:rPr>
-      </w:pPr>
-      <w:r>
-        <w:rPr>
-          <w:rFonts w:ascii="Times New Roman" w:hAnsi="Times New Roman" w:cs="Times New Roman"/>
-          <w:sz w:val="28"/>
-          <w:szCs w:val="28"/>
-        </w:rPr>
-        <w:t xml:space="preserve">User Register </w:t>
-      </w:r>
-    </w:p>
-    <w:p>
-      <w:pPr>
-        <w:rPr>
-          <w:rFonts w:ascii="Times New Roman" w:hAnsi="Times New Roman" w:cs="Times New Roman"/>
-          <w:sz w:val="28"/>
-          <w:szCs w:val="28"/>
-        </w:rPr>
-      </w:pPr>
-      <w:r>
-        <w:rPr>
-          <w:rFonts w:ascii="Times New Roman" w:hAnsi="Times New Roman" w:cs="Times New Roman"/>
-          <w:sz w:val="28"/>
-          <w:szCs w:val="28"/>
-        </w:rPr>
-        <w:t>All form input validate</w:t>
-      </w:r>
-    </w:p>
-    <w:p>
-      <w:pPr>
-        <w:rPr>
-          <w:rFonts w:ascii="Times New Roman" w:hAnsi="Times New Roman"/>
-          <w:sz w:val="28"/>
-          <w:szCs w:val="28"/>
-        </w:rPr>
-      </w:pPr>
-      <w:r>
-        <w:rPr>
-          <w:rFonts w:ascii="Times New Roman" w:hAnsi="Times New Roman" w:cs="Times New Roman"/>
-          <w:sz w:val="28"/>
-          <w:szCs w:val="28"/>
-        </w:rPr>
-        <w:t>Username – space validate</w:t>
-      </w:r>
-      <w:r>
-        <w:rPr>
-          <w:rFonts w:ascii="Times New Roman" w:hAnsi="Times New Roman" w:cs="Times New Roman"/>
-          <w:sz w:val="28"/>
-          <w:szCs w:val="28"/>
-        </w:rPr>
-        <w:t xml:space="preserve">, username </w:t>
-      </w:r>
-      <w:r>
-        <w:rPr>
-          <w:rFonts w:ascii="Times New Roman" w:hAnsi="Times New Roman" w:hint="cs"/>
-          <w:sz w:val="28"/>
-          <w:szCs w:val="28"/>
-          <w:cs/>
-        </w:rPr>
-        <w:t>ရှိပြီးသား မဖြစ်ရဘူး</w:t>
-      </w:r>
-    </w:p>
-    <w:p>
-      <w:pPr>
-        <w:rPr>
-          <w:rFonts w:ascii="Times New Roman" w:hAnsi="Times New Roman"/>
-          <w:sz w:val="28"/>
-          <w:szCs w:val="28"/>
-        </w:rPr>
-      </w:pPr>
-      <w:r>
-        <w:rPr>
-          <w:rFonts w:ascii="Times New Roman" w:hAnsi="Times New Roman"/>
-          <w:sz w:val="28"/>
-          <w:szCs w:val="28"/>
-        </w:rPr>
-        <w:t xml:space="preserve">Email </w:t>
-      </w:r>
-      <w:r>
-        <w:rPr>
-          <w:rFonts w:ascii="Times New Roman" w:hAnsi="Times New Roman" w:hint="cs"/>
-          <w:sz w:val="28"/>
-          <w:szCs w:val="28"/>
-          <w:cs/>
-        </w:rPr>
-        <w:t>ရှိပြီးသားမဖြစ်ရဘူး</w:t>
-      </w:r>
-    </w:p>
-    <w:p>
-      <w:pPr>
-        <w:rPr>
-          <w:rFonts w:ascii="Times New Roman" w:hAnsi="Times New Roman" w:cs="Times New Roman"/>
-          <w:sz w:val="28"/>
-          <w:szCs w:val="28"/>
-        </w:rPr>
-      </w:pPr>
-      <w:r>
-        <w:rPr>
-          <w:rFonts w:ascii="Times New Roman" w:hAnsi="Times New Roman" w:cs="Times New Roman"/>
-          <w:sz w:val="28"/>
-          <w:szCs w:val="28"/>
-        </w:rPr>
-        <w:t>Password – at least 8, at least 1 upper, 1 lower, 1 special, 1 number</w:t>
-      </w:r>
-    </w:p>
-    <w:p>
-      <w:pPr>
-        <w:rPr>
-          <w:rFonts w:ascii="Times New Roman" w:hAnsi="Times New Roman" w:cs="Times New Roman"/>
-          <w:sz w:val="28"/>
-          <w:szCs w:val="28"/>
-        </w:rPr>
-      </w:pPr>
-    </w:p>
-    <w:p>
-      <w:pPr>
-        <w:rPr>
-          <w:rFonts w:ascii="Times New Roman" w:hAnsi="Times New Roman" w:cs="Times New Roman"/>
-          <w:sz w:val="28"/>
-          <w:szCs w:val="28"/>
-        </w:rPr>
-      </w:pPr>
-      <w:r>
-        <w:rPr>
-          <w:rFonts w:ascii="Times New Roman" w:hAnsi="Times New Roman" w:cs="Times New Roman"/>
-          <w:sz w:val="28"/>
-          <w:szCs w:val="28"/>
-        </w:rPr>
-        <w:t>User Login</w:t>
-      </w:r>
-    </w:p>
-    <w:p>
-      <w:pPr>
-        <w:rPr>
-          <w:rFonts w:ascii="Times New Roman" w:hAnsi="Times New Roman" w:cs="Times New Roman"/>
-          <w:sz w:val="28"/>
-          <w:szCs w:val="28"/>
-        </w:rPr>
-      </w:pPr>
-      <w:r>
-        <w:rPr>
-          <w:rFonts w:ascii="Times New Roman" w:hAnsi="Times New Roman" w:cs="Times New Roman"/>
-          <w:sz w:val="28"/>
-          <w:szCs w:val="28"/>
-        </w:rPr>
-        <w:t>User name wrong output</w:t>
-      </w:r>
-    </w:p>
-    <w:p>
-      <w:pPr>
-        <w:rPr>
-          <w:rFonts w:ascii="Times New Roman" w:hAnsi="Times New Roman" w:cs="Times New Roman"/>
-          <w:sz w:val="28"/>
-          <w:szCs w:val="28"/>
-        </w:rPr>
-      </w:pPr>
-      <w:r>
-        <w:rPr>
-          <w:rFonts w:ascii="Times New Roman" w:hAnsi="Times New Roman" w:cs="Times New Roman"/>
-          <w:sz w:val="28"/>
-          <w:szCs w:val="28"/>
-        </w:rPr>
-        <w:t>Password wrong output</w:t>
-      </w:r>
-    </w:p>
-    <w:p>
-      <w:pPr>
-        <w:rPr>
-          <w:rFonts w:ascii="Times New Roman" w:hAnsi="Times New Roman"/>
-          <w:sz w:val="28"/>
-          <w:szCs w:val="28"/>
-        </w:rPr>
-      </w:pPr>
-    </w:p>
-    <w:p>
-      <w:pPr>
-        <w:rPr>
-          <w:rFonts w:ascii="Times New Roman" w:hAnsi="Times New Roman"/>
-          <w:sz w:val="28"/>
-          <w:szCs w:val="28"/>
-        </w:rPr>
-      </w:pPr>
-    </w:p>
-    <w:p>
-      <w:pPr>
-        <w:rPr>
-          <w:rFonts w:ascii="Times New Roman" w:hAnsi="Times New Roman" w:cs="Times New Roman"/>
-          <w:sz w:val="28"/>
-          <w:szCs w:val="28"/>
-        </w:rPr>
-      </w:pPr>
-      <w:r>
-        <w:rPr>
-          <w:rFonts w:ascii="Times New Roman" w:hAnsi="Times New Roman" w:cs="Times New Roman"/>
-          <w:sz w:val="28"/>
-          <w:szCs w:val="28"/>
-        </w:rPr>
-        <w:t xml:space="preserve">Company Register </w:t>
-      </w:r>
-    </w:p>
-    <w:p>
-      <w:pPr>
-        <w:rPr>
-          <w:rFonts w:ascii="Times New Roman" w:hAnsi="Times New Roman" w:cs="Times New Roman"/>
-          <w:sz w:val="28"/>
-          <w:szCs w:val="28"/>
-        </w:rPr>
-      </w:pPr>
-      <w:r>
-        <w:rPr>
-          <w:rFonts w:ascii="Times New Roman" w:hAnsi="Times New Roman" w:cs="Times New Roman"/>
-          <w:sz w:val="28"/>
-          <w:szCs w:val="28"/>
-        </w:rPr>
-        <w:t>All form input validate</w:t>
-      </w:r>
-    </w:p>
-    <w:p>
-      <w:pPr>
-        <w:rPr>
-          <w:rFonts w:ascii="Times New Roman" w:hAnsi="Times New Roman"/>
-          <w:sz w:val="28"/>
-          <w:szCs w:val="28"/>
-        </w:rPr>
-      </w:pPr>
-      <w:r>
-        <w:rPr>
-          <w:rFonts w:ascii="Times New Roman" w:hAnsi="Times New Roman" w:cs="Times New Roman"/>
-          <w:sz w:val="28"/>
-          <w:szCs w:val="28"/>
-        </w:rPr>
-        <w:t xml:space="preserve">Username – space validate, username </w:t>
-      </w:r>
-      <w:r>
-        <w:rPr>
-          <w:rFonts w:ascii="Times New Roman" w:hAnsi="Times New Roman" w:hint="cs"/>
-          <w:sz w:val="28"/>
-          <w:szCs w:val="28"/>
-          <w:cs/>
-        </w:rPr>
-        <w:t>ရှိပြီးသား မဖြစ်ရဘူး</w:t>
-      </w:r>
-    </w:p>
-    <w:p>
-      <w:pPr>
-        <w:rPr>
-          <w:rFonts w:ascii="Times New Roman" w:hAnsi="Times New Roman"/>
-          <w:sz w:val="28"/>
-          <w:szCs w:val="28"/>
-        </w:rPr>
-      </w:pPr>
-      <w:r>
-        <w:rPr>
-          <w:rFonts w:ascii="Times New Roman" w:hAnsi="Times New Roman"/>
-          <w:sz w:val="28"/>
-          <w:szCs w:val="28"/>
-        </w:rPr>
-        <w:t xml:space="preserve">Email </w:t>
-      </w:r>
-      <w:r>
-        <w:rPr>
-          <w:rFonts w:ascii="Times New Roman" w:hAnsi="Times New Roman" w:hint="cs"/>
-          <w:sz w:val="28"/>
-          <w:szCs w:val="28"/>
-          <w:cs/>
-        </w:rPr>
-        <w:t>ရှိပြီးသားမဖြစ်ရဘူး</w:t>
-      </w:r>
-    </w:p>
-    <w:p>
-      <w:pPr>
-        <w:rPr>
-          <w:rFonts w:ascii="Times New Roman" w:hAnsi="Times New Roman"/>
-          <w:sz w:val="28"/>
-          <w:szCs w:val="28"/>
-        </w:rPr>
-      </w:pPr>
-      <w:r>
-        <w:rPr>
-          <w:rFonts w:ascii="Times New Roman" w:hAnsi="Times New Roman" w:hint="cs"/>
-          <w:sz w:val="28"/>
-          <w:szCs w:val="28"/>
-          <w:cs/>
-        </w:rPr>
-        <w:t>ကုမ္ပဏီအမျိုးအစားမှာ ကုမ္ပဏီနာမည် ရှိပြီးသားမဖြစ်ရဘူး</w:t>
-      </w:r>
-    </w:p>
-    <w:p>
-      <w:pPr>
-        <w:rPr>
-          <w:rFonts w:ascii="Times New Roman" w:hAnsi="Times New Roman"/>
-          <w:sz w:val="28"/>
-          <w:szCs w:val="28"/>
-        </w:rPr>
-      </w:pPr>
-      <w:r>
-        <w:rPr>
-          <w:rFonts w:ascii="Times New Roman" w:hAnsi="Times New Roman" w:hint="cs"/>
-          <w:sz w:val="28"/>
-          <w:szCs w:val="28"/>
-          <w:cs/>
-        </w:rPr>
-        <w:t>ရေသန့်ကုမ္ပဏီ အမျိုးအစားမှာ ကောင်းသန့် ဆိုတဲ့ နာမည်ထပ်ရှိလို့မရဘူး</w:t>
-      </w:r>
-    </w:p>
-    <w:p>
-      <w:pPr>
-        <w:rPr>
-          <w:rFonts w:ascii="Times New Roman" w:hAnsi="Times New Roman"/>
-          <w:color w:val="FF0000"/>
-          <w:sz w:val="20"/>
-          <w:szCs w:val="20"/>
-        </w:rPr>
-      </w:pPr>
-      <w:r>
-        <w:rPr>
-          <w:rFonts w:ascii="Times New Roman" w:hAnsi="Times New Roman" w:cs="Myanmar Text"/>
-          <w:color w:val="FF0000"/>
-          <w:sz w:val="20"/>
-          <w:szCs w:val="20"/>
-        </w:rPr>
-        <w:t>(</w:t>
-      </w:r>
-      <w:r>
-        <w:rPr>
-          <w:rFonts w:ascii="Times New Roman" w:hAnsi="Times New Roman" w:cs="Myanmar Text" w:hint="cs"/>
-          <w:color w:val="FF0000"/>
-          <w:sz w:val="20"/>
-          <w:szCs w:val="20"/>
-          <w:cs/>
-        </w:rPr>
-        <w:t>ရေသန့်</w:t>
-      </w:r>
-      <w:r>
-        <w:rPr>
-          <w:rFonts w:ascii="Times New Roman" w:hAnsi="Times New Roman" w:cs="Myanmar Text"/>
-          <w:color w:val="FF0000"/>
-          <w:sz w:val="20"/>
-          <w:szCs w:val="20"/>
-          <w:cs/>
-        </w:rPr>
-        <w:t xml:space="preserve"> </w:t>
-      </w:r>
-      <w:r>
-        <w:rPr>
-          <w:rFonts w:ascii="Times New Roman" w:hAnsi="Times New Roman" w:cs="Myanmar Text" w:hint="cs"/>
-          <w:color w:val="FF0000"/>
-          <w:sz w:val="20"/>
-          <w:szCs w:val="20"/>
-          <w:cs/>
-        </w:rPr>
-        <w:t>ဖြန့်ချီရေး</w:t>
-      </w:r>
-      <w:r>
-        <w:rPr>
-          <w:rFonts w:ascii="Times New Roman" w:hAnsi="Times New Roman" w:cs="Myanmar Text"/>
-          <w:color w:val="FF0000"/>
-          <w:sz w:val="20"/>
-          <w:szCs w:val="20"/>
-          <w:cs/>
-        </w:rPr>
-        <w:t xml:space="preserve"> </w:t>
-      </w:r>
-      <w:r>
-        <w:rPr>
-          <w:rFonts w:ascii="Times New Roman" w:hAnsi="Times New Roman" w:cs="Myanmar Text" w:hint="cs"/>
-          <w:color w:val="FF0000"/>
-          <w:sz w:val="20"/>
-          <w:szCs w:val="20"/>
-          <w:cs/>
-        </w:rPr>
-        <w:t>ကုမ္ပဏီ</w:t>
-      </w:r>
-      <w:r>
-        <w:rPr>
-          <w:rFonts w:ascii="Times New Roman" w:hAnsi="Times New Roman" w:cs="Myanmar Text"/>
-          <w:color w:val="FF0000"/>
-          <w:sz w:val="20"/>
-          <w:szCs w:val="20"/>
-          <w:cs/>
-        </w:rPr>
-        <w:t xml:space="preserve"> </w:t>
-      </w:r>
-      <w:r>
-        <w:rPr>
-          <w:rFonts w:ascii="Times New Roman" w:hAnsi="Times New Roman" w:cs="Myanmar Text" w:hint="cs"/>
-          <w:color w:val="FF0000"/>
-          <w:sz w:val="20"/>
-          <w:szCs w:val="20"/>
-          <w:cs/>
-        </w:rPr>
-        <w:t>အမျိုးအစားအတွက်</w:t>
-      </w:r>
-      <w:r>
-        <w:rPr>
-          <w:rFonts w:ascii="Times New Roman" w:hAnsi="Times New Roman" w:cs="Myanmar Text"/>
-          <w:color w:val="FF0000"/>
-          <w:sz w:val="20"/>
-          <w:szCs w:val="20"/>
-          <w:cs/>
-        </w:rPr>
-        <w:t xml:space="preserve"> </w:t>
-      </w:r>
-      <w:r>
-        <w:rPr>
-          <w:rFonts w:ascii="Times New Roman" w:hAnsi="Times New Roman"/>
-          <w:color w:val="FF0000"/>
-          <w:sz w:val="20"/>
-          <w:szCs w:val="20"/>
-        </w:rPr>
-        <w:t xml:space="preserve">Kaung Thant </w:t>
-      </w:r>
-      <w:r>
-        <w:rPr>
-          <w:rFonts w:ascii="Times New Roman" w:hAnsi="Times New Roman" w:cs="Myanmar Text" w:hint="cs"/>
-          <w:color w:val="FF0000"/>
-          <w:sz w:val="20"/>
-          <w:szCs w:val="20"/>
-          <w:cs/>
-        </w:rPr>
-        <w:t>ဟူသော</w:t>
-      </w:r>
-      <w:r>
-        <w:rPr>
-          <w:rFonts w:ascii="Times New Roman" w:hAnsi="Times New Roman" w:cs="Myanmar Text"/>
-          <w:color w:val="FF0000"/>
-          <w:sz w:val="20"/>
-          <w:szCs w:val="20"/>
-          <w:cs/>
-        </w:rPr>
-        <w:t xml:space="preserve"> </w:t>
-      </w:r>
-      <w:r>
-        <w:rPr>
-          <w:rFonts w:ascii="Times New Roman" w:hAnsi="Times New Roman" w:cs="Myanmar Text" w:hint="cs"/>
-          <w:color w:val="FF0000"/>
-          <w:sz w:val="20"/>
-          <w:szCs w:val="20"/>
-          <w:cs/>
-        </w:rPr>
-        <w:t>ကုမ္ပဏီ</w:t>
-      </w:r>
-      <w:r>
-        <w:rPr>
-          <w:rFonts w:ascii="Times New Roman" w:hAnsi="Times New Roman" w:cs="Myanmar Text"/>
-          <w:color w:val="FF0000"/>
-          <w:sz w:val="20"/>
-          <w:szCs w:val="20"/>
-          <w:cs/>
-        </w:rPr>
-        <w:t xml:space="preserve"> </w:t>
-      </w:r>
-      <w:r>
-        <w:rPr>
-          <w:rFonts w:ascii="Times New Roman" w:hAnsi="Times New Roman" w:cs="Myanmar Text" w:hint="cs"/>
-          <w:color w:val="FF0000"/>
-          <w:sz w:val="20"/>
-          <w:szCs w:val="20"/>
-          <w:cs/>
-        </w:rPr>
-        <w:t>နာမည်</w:t>
-      </w:r>
-      <w:r>
-        <w:rPr>
-          <w:rFonts w:ascii="Times New Roman" w:hAnsi="Times New Roman" w:cs="Myanmar Text"/>
-          <w:color w:val="FF0000"/>
-          <w:sz w:val="20"/>
-          <w:szCs w:val="20"/>
-          <w:cs/>
-        </w:rPr>
-        <w:t xml:space="preserve"> </w:t>
-      </w:r>
-      <w:r>
-        <w:rPr>
-          <w:rFonts w:ascii="Times New Roman" w:hAnsi="Times New Roman" w:cs="Myanmar Text" w:hint="cs"/>
-          <w:color w:val="FF0000"/>
-          <w:sz w:val="20"/>
-          <w:szCs w:val="20"/>
-          <w:cs/>
-        </w:rPr>
-        <w:t>ရှိပြီးသားဖြစ်ပါသည်။</w:t>
-      </w:r>
-      <w:r>
-        <w:rPr>
-          <w:rFonts w:ascii="Times New Roman" w:hAnsi="Times New Roman" w:cs="Myanmar Text"/>
-          <w:color w:val="FF0000"/>
-          <w:sz w:val="20"/>
-          <w:szCs w:val="20"/>
-        </w:rPr>
-        <w:t>)</w:t>
-      </w:r>
-    </w:p>
-    <w:p>
-      <w:pPr>
-        <w:rPr>
-          <w:rFonts w:ascii="Times New Roman" w:hAnsi="Times New Roman" w:cs="Times New Roman"/>
-          <w:sz w:val="28"/>
-          <w:szCs w:val="28"/>
-        </w:rPr>
-      </w:pPr>
-      <w:r>
-        <w:rPr>
-          <w:rFonts w:ascii="Times New Roman" w:hAnsi="Times New Roman" w:cs="Times New Roman"/>
-          <w:sz w:val="28"/>
-          <w:szCs w:val="28"/>
-        </w:rPr>
-        <w:t>Password – at least 8, at least 1 upper, 1 lower, 1 special, 1 number</w:t>
-      </w:r>
-    </w:p>
-    <w:p>
-      <w:pPr>
-        <w:rPr>
-          <w:rFonts w:ascii="Times New Roman" w:hAnsi="Times New Roman" w:cs="Times New Roman"/>
-          <w:sz w:val="28"/>
-          <w:szCs w:val="28"/>
-        </w:rPr>
-      </w:pPr>
-    </w:p>
-    <w:p>
-      <w:pPr>
-        <w:rPr>
-          <w:rFonts w:ascii="Times New Roman" w:hAnsi="Times New Roman" w:cs="Times New Roman"/>
-          <w:sz w:val="28"/>
-          <w:szCs w:val="28"/>
-        </w:rPr>
-      </w:pPr>
-      <w:r>
-        <w:rPr>
-          <w:rFonts w:ascii="Times New Roman" w:hAnsi="Times New Roman" w:cs="Times New Roman"/>
-          <w:sz w:val="28"/>
-          <w:szCs w:val="28"/>
-        </w:rPr>
-        <w:t>Company Login</w:t>
-      </w:r>
-    </w:p>
-    <w:p>
-      <w:pPr>
-        <w:rPr>
-          <w:rFonts w:ascii="Times New Roman" w:hAnsi="Times New Roman" w:cs="Times New Roman"/>
-          <w:sz w:val="28"/>
-          <w:szCs w:val="28"/>
-        </w:rPr>
-      </w:pPr>
-      <w:r>
-        <w:rPr>
-          <w:rFonts w:ascii="Times New Roman" w:hAnsi="Times New Roman" w:cs="Times New Roman"/>
-          <w:sz w:val="28"/>
-          <w:szCs w:val="28"/>
-        </w:rPr>
-        <w:t>User name wrong output</w:t>
-      </w:r>
-    </w:p>
-    <w:p>
-      <w:pPr>
-        <w:rPr>
-          <w:rFonts w:ascii="Times New Roman" w:hAnsi="Times New Roman" w:cs="Times New Roman"/>
-          <w:sz w:val="28"/>
-          <w:szCs w:val="28"/>
-        </w:rPr>
-      </w:pPr>
-      <w:r>
-        <w:rPr>
-          <w:rFonts w:ascii="Times New Roman" w:hAnsi="Times New Roman" w:cs="Times New Roman"/>
-          <w:sz w:val="28"/>
-          <w:szCs w:val="28"/>
-        </w:rPr>
-        <w:t>Password wrong output</w:t>
-      </w:r>
-    </w:p>
-    <w:p>
-      <w:pPr>
-        <w:rPr>
           <w:rFonts w:ascii="Times New Roman" w:hAnsi="Times New Roman"/>
           <w:b/>
           <w:bCs/>
@@ -595,65 +20,18 @@
           <w:sz w:val="28"/>
           <w:szCs w:val="28"/>
         </w:rPr>
-        <w:lastRenderedPageBreak/>
-        <w:t>Customer Ordering</w:t>
-      </w:r>
-    </w:p>
-    <w:p>
-      <w:pPr>
-        <w:rPr>
-          <w:rFonts w:ascii="Times New Roman" w:hAnsi="Times New Roman"/>
-          <w:sz w:val="28"/>
-          <w:szCs w:val="28"/>
-        </w:rPr>
-      </w:pPr>
-      <w:r>
-        <w:rPr>
-          <w:rFonts w:ascii="Times New Roman" w:hAnsi="Times New Roman"/>
-          <w:sz w:val="28"/>
-          <w:szCs w:val="28"/>
-        </w:rPr>
-        <w:tab/>
-        <w:t>First choose what to order</w:t>
-      </w:r>
-    </w:p>
-    <w:p>
-      <w:pPr>
-        <w:rPr>
-          <w:rFonts w:ascii="Times New Roman" w:hAnsi="Times New Roman"/>
-          <w:sz w:val="28"/>
-          <w:szCs w:val="28"/>
-        </w:rPr>
-      </w:pPr>
-      <w:r>
-        <w:rPr>
-          <w:rFonts w:ascii="Times New Roman" w:hAnsi="Times New Roman"/>
-          <w:sz w:val="28"/>
-          <w:szCs w:val="28"/>
-        </w:rPr>
-        <w:tab/>
-      </w:r>
-      <w:r>
-        <w:rPr>
-          <w:rFonts w:ascii="Times New Roman" w:hAnsi="Times New Roman"/>
-          <w:sz w:val="28"/>
-          <w:szCs w:val="28"/>
-        </w:rPr>
-        <w:tab/>
-        <w:t>Then fill form</w:t>
-      </w:r>
-    </w:p>
-    <w:p>
-      <w:pPr>
-        <w:rPr>
-          <w:rFonts w:ascii="Times New Roman" w:hAnsi="Times New Roman"/>
-          <w:sz w:val="28"/>
-          <w:szCs w:val="28"/>
-        </w:rPr>
-      </w:pPr>
-    </w:p>
-    <w:p>
-      <w:pPr>
+        <w:t xml:space="preserve">Company </w:t>
+      </w:r>
+    </w:p>
+    <w:p>
+      <w:pPr>
+        <w:rPr>
+          <w:rFonts w:ascii="Times New Roman" w:hAnsi="Times New Roman"/>
+          <w:sz w:val="28"/>
+          <w:szCs w:val="28"/>
+        </w:rPr>
+      </w:pPr>
+      <w:r>
         <w:rPr>
           <w:rFonts w:ascii="Times New Roman" w:hAnsi="Times New Roman"/>
           <w:b/>
@@ -661,222 +39,6 @@
           <w:sz w:val="28"/>
           <w:szCs w:val="28"/>
         </w:rPr>
-      </w:pPr>
-      <w:r>
-        <w:rPr>
-          <w:rFonts w:ascii="Times New Roman" w:hAnsi="Times New Roman"/>
-          <w:b/>
-          <w:bCs/>
-          <w:sz w:val="28"/>
-          <w:szCs w:val="28"/>
-        </w:rPr>
-        <w:t>Customer Viewing Order</w:t>
-      </w:r>
-      <w:r>
-        <w:rPr>
-          <w:rFonts w:ascii="Times New Roman" w:hAnsi="Times New Roman"/>
-          <w:b/>
-          <w:bCs/>
-          <w:sz w:val="28"/>
-          <w:szCs w:val="28"/>
-        </w:rPr>
-        <w:t xml:space="preserve"> (can view orders by selecting day) </w:t>
-      </w:r>
-    </w:p>
-    <w:p>
-      <w:pPr>
-        <w:rPr>
-          <w:rFonts w:ascii="Times New Roman" w:hAnsi="Times New Roman"/>
-          <w:sz w:val="28"/>
-          <w:szCs w:val="28"/>
-        </w:rPr>
-      </w:pPr>
-      <w:r>
-        <w:rPr>
-          <w:rFonts w:ascii="Times New Roman" w:hAnsi="Times New Roman"/>
-          <w:sz w:val="28"/>
-          <w:szCs w:val="28"/>
-        </w:rPr>
-        <w:tab/>
-        <w:t>NOT DELIVERED</w:t>
-      </w:r>
-    </w:p>
-    <w:p>
-      <w:pPr>
-        <w:rPr>
-          <w:rFonts w:ascii="Times New Roman" w:hAnsi="Times New Roman"/>
-          <w:sz w:val="28"/>
-          <w:szCs w:val="28"/>
-        </w:rPr>
-      </w:pPr>
-      <w:r>
-        <w:rPr>
-          <w:rFonts w:ascii="Times New Roman" w:hAnsi="Times New Roman"/>
-          <w:sz w:val="28"/>
-          <w:szCs w:val="28"/>
-        </w:rPr>
-        <w:tab/>
-      </w:r>
-      <w:r>
-        <w:rPr>
-          <w:rFonts w:ascii="Times New Roman" w:hAnsi="Times New Roman"/>
-          <w:sz w:val="28"/>
-          <w:szCs w:val="28"/>
-        </w:rPr>
-        <w:tab/>
-        <w:t>NOT_START_DELIVERY &gt;&gt; Can Delete Orders</w:t>
-      </w:r>
-    </w:p>
-    <w:p>
-      <w:pPr>
-        <w:rPr>
-          <w:rFonts w:ascii="Times New Roman" w:hAnsi="Times New Roman"/>
-          <w:sz w:val="28"/>
-          <w:szCs w:val="28"/>
-        </w:rPr>
-      </w:pPr>
-      <w:r>
-        <w:rPr>
-          <w:rFonts w:ascii="Times New Roman" w:hAnsi="Times New Roman"/>
-          <w:sz w:val="28"/>
-          <w:szCs w:val="28"/>
-        </w:rPr>
-        <w:tab/>
-      </w:r>
-      <w:r>
-        <w:rPr>
-          <w:rFonts w:ascii="Times New Roman" w:hAnsi="Times New Roman"/>
-          <w:sz w:val="28"/>
-          <w:szCs w:val="28"/>
-        </w:rPr>
-        <w:tab/>
-        <w:t>ON_DELIVERY &gt;&gt; Can locate truck</w:t>
-      </w:r>
-    </w:p>
-    <w:p>
-      <w:pPr>
-        <w:rPr>
-          <w:rFonts w:ascii="Times New Roman" w:hAnsi="Times New Roman"/>
-          <w:sz w:val="28"/>
-          <w:szCs w:val="28"/>
-        </w:rPr>
-      </w:pPr>
-      <w:r>
-        <w:rPr>
-          <w:rFonts w:ascii="Times New Roman" w:hAnsi="Times New Roman"/>
-          <w:sz w:val="28"/>
-          <w:szCs w:val="28"/>
-        </w:rPr>
-        <w:tab/>
-      </w:r>
-    </w:p>
-    <w:p>
-      <w:pPr>
-        <w:rPr>
-          <w:rFonts w:ascii="Times New Roman" w:hAnsi="Times New Roman"/>
-          <w:sz w:val="28"/>
-          <w:szCs w:val="28"/>
-        </w:rPr>
-      </w:pPr>
-      <w:r>
-        <w:rPr>
-          <w:rFonts w:ascii="Times New Roman" w:hAnsi="Times New Roman"/>
-          <w:sz w:val="28"/>
-          <w:szCs w:val="28"/>
-        </w:rPr>
-        <w:tab/>
-        <w:t>DELIVERED &gt;&gt; nothing</w:t>
-      </w:r>
-    </w:p>
-    <w:p>
-      <w:pPr>
-        <w:rPr>
-          <w:rFonts w:ascii="Times New Roman" w:hAnsi="Times New Roman"/>
-          <w:sz w:val="28"/>
-          <w:szCs w:val="28"/>
-        </w:rPr>
-      </w:pPr>
-    </w:p>
-    <w:p>
-      <w:pPr>
-        <w:rPr>
-          <w:rFonts w:ascii="Times New Roman" w:hAnsi="Times New Roman"/>
-          <w:b/>
-          <w:bCs/>
-          <w:sz w:val="28"/>
-          <w:szCs w:val="28"/>
-        </w:rPr>
-      </w:pPr>
-      <w:r>
-        <w:rPr>
-          <w:rFonts w:ascii="Times New Roman" w:hAnsi="Times New Roman"/>
-          <w:b/>
-          <w:bCs/>
-          <w:sz w:val="28"/>
-          <w:szCs w:val="28"/>
-        </w:rPr>
-        <w:t>Profiles can be edited</w:t>
-      </w:r>
-    </w:p>
-    <w:p>
-      <w:pPr>
-        <w:rPr>
-          <w:rFonts w:ascii="Times New Roman" w:hAnsi="Times New Roman"/>
-          <w:b/>
-          <w:bCs/>
-          <w:sz w:val="28"/>
-          <w:szCs w:val="28"/>
-        </w:rPr>
-      </w:pPr>
-      <w:r>
-        <w:rPr>
-          <w:rFonts w:ascii="Times New Roman" w:hAnsi="Times New Roman"/>
-          <w:b/>
-          <w:bCs/>
-          <w:sz w:val="28"/>
-          <w:szCs w:val="28"/>
-        </w:rPr>
-        <w:br w:type="page"/>
-      </w:r>
-    </w:p>
-    <w:p>
-      <w:pPr>
-        <w:rPr>
-          <w:rFonts w:ascii="Times New Roman" w:hAnsi="Times New Roman"/>
-          <w:b/>
-          <w:bCs/>
-          <w:sz w:val="28"/>
-          <w:szCs w:val="28"/>
-        </w:rPr>
-      </w:pPr>
-      <w:r>
-        <w:rPr>
-          <w:rFonts w:ascii="Times New Roman" w:hAnsi="Times New Roman"/>
-          <w:b/>
-          <w:bCs/>
-          <w:sz w:val="28"/>
-          <w:szCs w:val="28"/>
-        </w:rPr>
-        <w:lastRenderedPageBreak/>
-        <w:t xml:space="preserve">Company </w:t>
-      </w:r>
-    </w:p>
-    <w:p>
-      <w:pPr>
-        <w:rPr>
-          <w:rFonts w:ascii="Times New Roman" w:hAnsi="Times New Roman"/>
-          <w:sz w:val="28"/>
-          <w:szCs w:val="28"/>
-        </w:rPr>
-      </w:pPr>
-      <w:r>
-        <w:rPr>
-          <w:rFonts w:ascii="Times New Roman" w:hAnsi="Times New Roman"/>
-          <w:b/>
-          <w:bCs/>
-          <w:sz w:val="28"/>
-          <w:szCs w:val="28"/>
-        </w:rPr>
         <w:tab/>
       </w:r>
       <w:r>
@@ -968,8 +130,18 @@
           <w:sz w:val="24"/>
           <w:szCs w:val="24"/>
         </w:rPr>
-        <w:t xml:space="preserve"> not loaded, only limit==avilable</w:t>
-      </w:r>
+        <w:t xml:space="preserve"> not loaded, only limit==</w:t>
+      </w:r>
+      <w:proofErr w:type="spellStart"/>
+      <w:r>
+        <w:rPr>
+          <w:rFonts w:ascii="Times New Roman" w:hAnsi="Times New Roman"/>
+          <w:sz w:val="24"/>
+          <w:szCs w:val="24"/>
+        </w:rPr>
+        <w:t>avilable</w:t>
+      </w:r>
+      <w:proofErr w:type="spellEnd"/>
     </w:p>
     <w:p>
       <w:pPr>
@@ -1081,7 +253,25 @@
           <w:sz w:val="21"/>
           <w:szCs w:val="21"/>
         </w:rPr>
-        <w:t>available – orderQty &gt; 0 success</w:t>
+        <w:t xml:space="preserve">available – </w:t>
+      </w:r>
+      <w:proofErr w:type="spellStart"/>
+      <w:r>
+        <w:rPr>
+          <w:rFonts w:ascii="Times New Roman" w:hAnsi="Times New Roman"/>
+          <w:sz w:val="21"/>
+          <w:szCs w:val="21"/>
+        </w:rPr>
+        <w:t>orderQty</w:t>
+      </w:r>
+      <w:proofErr w:type="spellEnd"/>
+      <w:r>
+        <w:rPr>
+          <w:rFonts w:ascii="Times New Roman" w:hAnsi="Times New Roman"/>
+          <w:sz w:val="21"/>
+          <w:szCs w:val="21"/>
+        </w:rPr>
+        <w:t xml:space="preserve"> &gt; 0 success</w:t>
       </w:r>
       <w:r>
         <w:rPr>
@@ -1131,23 +321,25 @@
           <w:sz w:val="21"/>
           <w:szCs w:val="21"/>
         </w:rPr>
-        <w:t xml:space="preserve">available – orderQty = 0 full </w:t>
-      </w:r>
+        <w:t xml:space="preserve">available – </w:t>
+      </w:r>
+      <w:proofErr w:type="spellStart"/>
       <w:r>
         <w:rPr>
           <w:rFonts w:ascii="Times New Roman" w:hAnsi="Times New Roman"/>
           <w:sz w:val="21"/>
           <w:szCs w:val="21"/>
         </w:rPr>
-        <w:t>avail up</w:t>
-      </w:r>
+        <w:t>orderQty</w:t>
+      </w:r>
+      <w:proofErr w:type="spellEnd"/>
       <w:r>
         <w:rPr>
           <w:rFonts w:ascii="Times New Roman" w:hAnsi="Times New Roman"/>
           <w:sz w:val="21"/>
           <w:szCs w:val="21"/>
         </w:rPr>
-        <w:t>date</w:t>
+        <w:t xml:space="preserve"> = 0 full </w:t>
       </w:r>
       <w:r>
         <w:rPr>
@@ -1155,7 +347,7 @@
           <w:sz w:val="21"/>
           <w:szCs w:val="21"/>
         </w:rPr>
-        <w:t xml:space="preserve"> ON_DELIVERY</w:t>
+        <w:t>avail up</w:t>
       </w:r>
       <w:r>
         <w:rPr>
@@ -1163,6 +355,22 @@
           <w:sz w:val="21"/>
           <w:szCs w:val="21"/>
         </w:rPr>
+        <w:t>date</w:t>
+      </w:r>
+      <w:r>
+        <w:rPr>
+          <w:rFonts w:ascii="Times New Roman" w:hAnsi="Times New Roman"/>
+          <w:sz w:val="21"/>
+          <w:szCs w:val="21"/>
+        </w:rPr>
+        <w:t xml:space="preserve"> ON_DELIVERY</w:t>
+      </w:r>
+      <w:r>
+        <w:rPr>
+          <w:rFonts w:ascii="Times New Roman" w:hAnsi="Times New Roman"/>
+          <w:sz w:val="21"/>
+          <w:szCs w:val="21"/>
+        </w:rPr>
         <w:t xml:space="preserve"> add delivery table</w:t>
       </w:r>
     </w:p>
@@ -1245,7 +453,61 @@
           <w:sz w:val="24"/>
           <w:szCs w:val="24"/>
         </w:rPr>
-        <w:t>available – orderQty &lt; 0 can’t put orderQty is greather than avail</w:t>
+        <w:t xml:space="preserve">available – </w:t>
+      </w:r>
+      <w:proofErr w:type="spellStart"/>
+      <w:r>
+        <w:rPr>
+          <w:rFonts w:ascii="Times New Roman" w:hAnsi="Times New Roman"/>
+          <w:sz w:val="24"/>
+          <w:szCs w:val="24"/>
+        </w:rPr>
+        <w:t>orderQty</w:t>
+      </w:r>
+      <w:proofErr w:type="spellEnd"/>
+      <w:r>
+        <w:rPr>
+          <w:rFonts w:ascii="Times New Roman" w:hAnsi="Times New Roman"/>
+          <w:sz w:val="24"/>
+          <w:szCs w:val="24"/>
+        </w:rPr>
+        <w:t xml:space="preserve"> &lt; 0 can’t put </w:t>
+      </w:r>
+      <w:proofErr w:type="spellStart"/>
+      <w:r>
+        <w:rPr>
+          <w:rFonts w:ascii="Times New Roman" w:hAnsi="Times New Roman"/>
+          <w:sz w:val="24"/>
+          <w:szCs w:val="24"/>
+        </w:rPr>
+        <w:t>orderQty</w:t>
+      </w:r>
+      <w:proofErr w:type="spellEnd"/>
+      <w:r>
+        <w:rPr>
+          <w:rFonts w:ascii="Times New Roman" w:hAnsi="Times New Roman"/>
+          <w:sz w:val="24"/>
+          <w:szCs w:val="24"/>
+        </w:rPr>
+        <w:t xml:space="preserve"> is </w:t>
+      </w:r>
+      <w:proofErr w:type="spellStart"/>
+      <w:r>
+        <w:rPr>
+          <w:rFonts w:ascii="Times New Roman" w:hAnsi="Times New Roman"/>
+          <w:sz w:val="24"/>
+          <w:szCs w:val="24"/>
+        </w:rPr>
+        <w:t>greather</w:t>
+      </w:r>
+      <w:proofErr w:type="spellEnd"/>
+      <w:r>
+        <w:rPr>
+          <w:rFonts w:ascii="Times New Roman" w:hAnsi="Times New Roman"/>
+          <w:sz w:val="24"/>
+          <w:szCs w:val="24"/>
+        </w:rPr>
+        <w:t xml:space="preserve"> than avail</w:t>
       </w:r>
     </w:p>
     <w:p>
@@ -1450,7 +712,7 @@
     <w:p>
       <w:pPr>
         <w:rPr>
-          <w:rFonts w:ascii="Times New Roman" w:hAnsi="Times New Roman" w:hint="cs"/>
+          <w:rFonts w:ascii="Times New Roman" w:hAnsi="Times New Roman"/>
           <w:sz w:val="28"/>
           <w:szCs w:val="28"/>
           <w:cs/>
@@ -1610,7 +872,7 @@
     <w:p>
       <w:pPr>
         <w:rPr>
-          <w:rFonts w:ascii="Times New Roman" w:hAnsi="Times New Roman" w:hint="cs"/>
+          <w:rFonts w:ascii="Times New Roman" w:hAnsi="Times New Roman"/>
           <w:sz w:val="28"/>
           <w:szCs w:val="28"/>
         </w:rPr>

</xml_diff>